<commit_message>
Rebuild the README from the promoted manuscript and commit the promotion
The README now carries the two-scales title, the 242-word abstract and all
fourteen floats, four figures and ten tables, in the order they appear in
Manuscript.qmd, rebuilt from a fresh HTML render by build-readme.py.

Also commits the work of 2026-09-02: the field-plot classifier as the
study's response, the Springer Basic author-date style, the table-format
capture and body-format hooks, the value audit chunk, Fig1 to Fig4, the
two superseded drafts under 01.manuscript/drafts, the derived-plot outputs
moved aside under their own README, and the handback, promotion and
table-format archives. The stale knitr cache, the unzipped repo snapshot
and the archived copies of the seed-drawn model tables are ignored, for
the reasons the ignore file already gives for their live counterparts.
</commit_message>
<xml_diff>
--- a/01.manuscript/Cover Letter.docx
+++ b/01.manuscript/Cover Letter.docx
@@ -5,7 +5,19 @@
     <w:p>
       <w:pPr>
         <w:spacing w:line="276" w:lineRule="auto"/>
-      </w:pPr>
+        <w:rPr>
+          <w:sz w:val="22"/>
+          <w:szCs w:val="22"/>
+        </w:rPr>
+      </w:pPr>
+      <w:r>
+        <w:rPr>
+          <w:rFonts w:ascii="Calibri" w:eastAsia="Calibri" w:hAnsi="Calibri" w:cs="Calibri"/>
+          <w:sz w:val="22"/>
+          <w:szCs w:val="22"/>
+        </w:rPr>
+        <w:t xml:space="preserve">Dr </w:t>
+      </w:r>
       <w:r>
         <w:rPr>
           <w:rFonts w:ascii="Calibri" w:eastAsia="Calibri" w:hAnsi="Calibri" w:cs="Calibri"/>
@@ -18,6 +30,10 @@
     <w:p>
       <w:pPr>
         <w:spacing w:line="276" w:lineRule="auto"/>
+        <w:rPr>
+          <w:sz w:val="22"/>
+          <w:szCs w:val="22"/>
+        </w:rPr>
       </w:pPr>
       <w:r>
         <w:rPr>
@@ -30,46 +46,141 @@
     </w:p>
     <w:p>
       <w:pPr>
+        <w:spacing w:after="240" w:line="360" w:lineRule="auto"/>
+        <w:rPr>
+          <w:rFonts w:ascii="Calibri" w:hAnsi="Calibri" w:cs="Calibri"/>
+          <w:sz w:val="22"/>
+          <w:szCs w:val="22"/>
+        </w:rPr>
+      </w:pPr>
+      <w:hyperlink r:id="rId5" w:history="1">
+        <w:r>
+          <w:rPr>
+            <w:rStyle w:val="Hyperlink"/>
+            <w:rFonts w:ascii="Calibri" w:hAnsi="Calibri" w:cs="Calibri"/>
+            <w:sz w:val="22"/>
+            <w:szCs w:val="22"/>
+          </w:rPr>
+          <w:t>seamusrobertmurphy@gmail.com</w:t>
+        </w:r>
+      </w:hyperlink>
+      <w:r>
+        <w:rPr>
+          <w:rFonts w:ascii="Calibri" w:hAnsi="Calibri" w:cs="Calibri"/>
+          <w:sz w:val="22"/>
+          <w:szCs w:val="22"/>
+        </w:rPr>
+        <w:t xml:space="preserve"> </w:t>
+      </w:r>
+    </w:p>
+    <w:p>
+      <w:pPr>
         <w:spacing w:line="276" w:lineRule="auto"/>
-      </w:pPr>
-      <w:r>
-        <w:rPr>
-          <w:rFonts w:ascii="Calibri" w:eastAsia="Calibri" w:hAnsi="Calibri" w:cs="Calibri"/>
-          <w:sz w:val="22"/>
-          <w:szCs w:val="22"/>
-        </w:rPr>
-        <w:t>Forest Carbon Verification, TÜV SÜD</w:t>
+        <w:rPr>
+          <w:rFonts w:ascii="Calibri" w:hAnsi="Calibri" w:cs="Calibri"/>
+          <w:sz w:val="22"/>
+          <w:szCs w:val="22"/>
+        </w:rPr>
+      </w:pPr>
+      <w:r>
+        <w:rPr>
+          <w:rFonts w:ascii="Calibri" w:hAnsi="Calibri" w:cs="Calibri"/>
+          <w:sz w:val="22"/>
+          <w:szCs w:val="22"/>
+        </w:rPr>
+        <w:t xml:space="preserve">Editors-in-Chief, </w:t>
       </w:r>
     </w:p>
     <w:p>
       <w:pPr>
         <w:spacing w:line="276" w:lineRule="auto"/>
-      </w:pPr>
-      <w:r>
-        <w:rPr>
-          <w:rFonts w:ascii="Calibri" w:eastAsia="Calibri" w:hAnsi="Calibri" w:cs="Calibri"/>
-          <w:sz w:val="22"/>
-          <w:szCs w:val="22"/>
-        </w:rPr>
-        <w:t>Comox, British Columbia, Canada</w:t>
-      </w:r>
-    </w:p>
-    <w:p>
-      <w:pPr>
-        <w:spacing w:after="400" w:line="276" w:lineRule="auto"/>
-      </w:pPr>
-      <w:r>
-        <w:rPr>
-          <w:rFonts w:ascii="Calibri" w:eastAsia="Calibri" w:hAnsi="Calibri" w:cs="Calibri"/>
-          <w:sz w:val="22"/>
-          <w:szCs w:val="22"/>
-        </w:rPr>
-        <w:t>seamusrobertmurphy@gmail.com</w:t>
-      </w:r>
-    </w:p>
-    <w:p>
-      <w:pPr>
-        <w:spacing w:after="200" w:line="276" w:lineRule="auto"/>
+        <w:rPr>
+          <w:rFonts w:ascii="Calibri" w:hAnsi="Calibri" w:cs="Calibri"/>
+          <w:sz w:val="22"/>
+          <w:szCs w:val="22"/>
+        </w:rPr>
+      </w:pPr>
+      <w:r>
+        <w:rPr>
+          <w:rFonts w:ascii="Calibri" w:hAnsi="Calibri" w:cs="Calibri"/>
+          <w:sz w:val="22"/>
+          <w:szCs w:val="22"/>
+        </w:rPr>
+        <w:t>Journal of Pest Science</w:t>
+      </w:r>
+    </w:p>
+    <w:p>
+      <w:pPr>
+        <w:spacing w:line="276" w:lineRule="auto"/>
+        <w:rPr>
+          <w:rFonts w:ascii="Calibri" w:hAnsi="Calibri" w:cs="Calibri"/>
+          <w:sz w:val="22"/>
+          <w:szCs w:val="22"/>
+        </w:rPr>
+      </w:pPr>
+      <w:r>
+        <w:rPr>
+          <w:rFonts w:ascii="Calibri" w:hAnsi="Calibri" w:cs="Calibri"/>
+          <w:sz w:val="22"/>
+          <w:szCs w:val="22"/>
+        </w:rPr>
+        <w:t>Tiergartenstrasse 17</w:t>
+      </w:r>
+    </w:p>
+    <w:p>
+      <w:pPr>
+        <w:spacing w:after="240" w:line="276" w:lineRule="auto"/>
+        <w:rPr>
+          <w:rFonts w:ascii="Calibri" w:hAnsi="Calibri" w:cs="Calibri"/>
+          <w:sz w:val="22"/>
+          <w:szCs w:val="22"/>
+        </w:rPr>
+      </w:pPr>
+      <w:r>
+        <w:rPr>
+          <w:rFonts w:ascii="Calibri" w:hAnsi="Calibri" w:cs="Calibri"/>
+          <w:sz w:val="22"/>
+          <w:szCs w:val="22"/>
+        </w:rPr>
+        <w:t>69121 Heidelberg</w:t>
+      </w:r>
+      <w:r>
+        <w:rPr>
+          <w:rFonts w:ascii="Calibri" w:hAnsi="Calibri" w:cs="Calibri"/>
+          <w:sz w:val="22"/>
+          <w:szCs w:val="22"/>
+        </w:rPr>
+        <w:t>, DE</w:t>
+      </w:r>
+    </w:p>
+    <w:p>
+      <w:pPr>
+        <w:spacing w:line="360" w:lineRule="auto"/>
+        <w:rPr>
+          <w:rFonts w:ascii="Calibri" w:hAnsi="Calibri" w:cs="Calibri"/>
+          <w:sz w:val="21"/>
+          <w:szCs w:val="21"/>
+        </w:rPr>
+      </w:pPr>
+      <w:r>
+        <w:rPr>
+          <w:rFonts w:ascii="Calibri" w:eastAsia="Calibri" w:hAnsi="Calibri" w:cs="Calibri"/>
+          <w:b/>
+          <w:bCs/>
+          <w:sz w:val="22"/>
+          <w:szCs w:val="22"/>
+        </w:rPr>
+        <w:t>RE: Submission of Original Research Paper to Journal of Pest Science</w:t>
+      </w:r>
+    </w:p>
+    <w:p>
+      <w:pPr>
+        <w:spacing w:line="276" w:lineRule="auto"/>
+        <w:rPr>
+          <w:rFonts w:ascii="Calibri" w:eastAsia="Calibri" w:hAnsi="Calibri" w:cs="Calibri"/>
+          <w:sz w:val="22"/>
+          <w:szCs w:val="22"/>
+        </w:rPr>
       </w:pPr>
       <w:r>
         <w:rPr>
@@ -78,169 +189,166 @@
           <w:szCs w:val="22"/>
         </w:rPr>
         <w:t>Dear Editor,</w:t>
-      </w:r>
-    </w:p>
-    <w:p>
-      <w:pPr>
-        <w:spacing w:after="200" w:line="276" w:lineRule="auto"/>
-      </w:pPr>
-      <w:r>
-        <w:rPr>
-          <w:rFonts w:ascii="Calibri" w:eastAsia="Calibri" w:hAnsi="Calibri" w:cs="Calibri"/>
-          <w:sz w:val="22"/>
-          <w:szCs w:val="22"/>
-        </w:rPr>
-        <w:t xml:space="preserve">I am submitting "Testing the wind disruption hypothesis for beetle refugia: Stand density, terrain and wind as competing controls on mountain pine beetle attack (Dendroctonus ponderosae) in the Selkirk Mountains of British Columbia" for consideration as an Original </w:t>
-      </w:r>
-      <w:proofErr w:type="gramStart"/>
-      <w:r>
-        <w:rPr>
-          <w:rFonts w:ascii="Calibri" w:eastAsia="Calibri" w:hAnsi="Calibri" w:cs="Calibri"/>
-          <w:sz w:val="22"/>
-          <w:szCs w:val="22"/>
-        </w:rPr>
-        <w:t>Full Length</w:t>
-      </w:r>
-      <w:proofErr w:type="gramEnd"/>
-      <w:r>
-        <w:rPr>
-          <w:rFonts w:ascii="Calibri" w:eastAsia="Calibri" w:hAnsi="Calibri" w:cs="Calibri"/>
-          <w:sz w:val="22"/>
-          <w:szCs w:val="22"/>
-        </w:rPr>
-        <w:t xml:space="preserve"> Article.</w:t>
-      </w:r>
-    </w:p>
-    <w:p>
-      <w:pPr>
-        <w:spacing w:after="200" w:line="276" w:lineRule="auto"/>
-      </w:pPr>
-      <w:r>
-        <w:rPr>
-          <w:rFonts w:ascii="Calibri" w:eastAsia="Calibri" w:hAnsi="Calibri" w:cs="Calibri"/>
-          <w:sz w:val="22"/>
-          <w:szCs w:val="22"/>
-        </w:rPr>
-        <w:t>Krawchuk et al. (2020) proposed three mechanisms for refugia from mountain pine beetle: topographic shading that relieves water stress, low host density that admits the wind disrupting the aggregation pheromone, and a scarcity of large-diameter hosts. The proposal is widely cited and, so far as I can establish, has never been fitted. This paper fits all three on one landscape.</w:t>
-      </w:r>
-    </w:p>
-    <w:p>
-      <w:pPr>
-        <w:spacing w:after="200" w:line="276" w:lineRule="auto"/>
-      </w:pPr>
-      <w:r>
-        <w:rPr>
-          <w:rFonts w:ascii="Calibri" w:eastAsia="Calibri" w:hAnsi="Calibri" w:cs="Calibri"/>
-          <w:sz w:val="22"/>
-          <w:szCs w:val="22"/>
-        </w:rPr>
-        <w:t>The wind mechanism holds, but only at a resolution the insect can be said to experience. Across 59 sixteen-day Landsat epochs, stand density interacts negatively with a terrain-resolved wind field: a dense canopy is worth less to the beetle where and when the wind blows harder. The interaction survives a within-season spread term, so it is not the outbreak's own contagion wearing a wind coefficient.</w:t>
-      </w:r>
-    </w:p>
-    <w:p>
-      <w:pPr>
-        <w:spacing w:after="200" w:line="276" w:lineRule="auto"/>
-      </w:pPr>
-      <w:r>
-        <w:rPr>
-          <w:rFonts w:ascii="Calibri" w:eastAsia="Calibri" w:hAnsi="Calibri" w:cs="Calibri"/>
-          <w:sz w:val="22"/>
-          <w:szCs w:val="22"/>
-        </w:rPr>
-        <w:t>That changes what a refugium is. Wind has no main effect; it changes what stand density is worth. A refugium is a conjunction rather than a place, a thin stand and wind in the same weeks the insect flies. Mapping exposed ground alone finds nothing, and neither does mapping thin stands. The shading mechanism fails harder: it runs backwards, with shaded ground carrying more attack.</w:t>
-      </w:r>
-    </w:p>
-    <w:p>
-      <w:pPr>
-        <w:spacing w:after="200" w:line="276" w:lineRule="auto"/>
-      </w:pPr>
-      <w:r>
-        <w:rPr>
-          <w:rFonts w:ascii="Calibri" w:eastAsia="Calibri" w:hAnsi="Calibri" w:cs="Calibri"/>
-          <w:sz w:val="22"/>
-          <w:szCs w:val="22"/>
-        </w:rPr>
-        <w:t>Two measurement results travel beyond this landscape. Flight-window radiation takes two fifths of the apparent density-by-terrain-exposure interaction, so a terrain wind index is partly an insolation measurement. Previous-year attack destabilises the landform terms, so a landform variable in a spreading outbreak partly records where the outbreak has already been.</w:t>
-      </w:r>
-    </w:p>
-    <w:p>
-      <w:pPr>
-        <w:spacing w:after="200" w:line="276" w:lineRule="auto"/>
-      </w:pPr>
-      <w:r>
-        <w:rPr>
-          <w:rFonts w:ascii="Calibri" w:eastAsia="Calibri" w:hAnsi="Calibri" w:cs="Calibri"/>
-          <w:sz w:val="22"/>
-          <w:szCs w:val="22"/>
-        </w:rPr>
-        <w:t xml:space="preserve">The study shares its landscape, and part of its Landsat and terrain covariates with Murphy, Leslie, Wilson and Banks (2026), Forest Ecology and Management 618, 123985, whose response </w:t>
-      </w:r>
-      <w:r>
-        <w:rPr>
-          <w:rFonts w:ascii="Calibri" w:eastAsia="Calibri" w:hAnsi="Calibri" w:cs="Calibri"/>
-          <w:sz w:val="22"/>
-          <w:szCs w:val="22"/>
-        </w:rPr>
-        <w:t xml:space="preserve">was </w:t>
-      </w:r>
-      <w:r>
-        <w:rPr>
-          <w:rFonts w:ascii="Calibri" w:eastAsia="Calibri" w:hAnsi="Calibri" w:cs="Calibri"/>
-          <w:sz w:val="22"/>
-          <w:szCs w:val="22"/>
-        </w:rPr>
-        <w:t>conifer seedling establishment. Here the response is beetle attack, and the models and period differ</w:t>
-      </w:r>
-      <w:r>
-        <w:rPr>
-          <w:rFonts w:ascii="Calibri" w:eastAsia="Calibri" w:hAnsi="Calibri" w:cs="Calibri"/>
-          <w:sz w:val="22"/>
-          <w:szCs w:val="22"/>
-        </w:rPr>
-        <w:t xml:space="preserve">. Specifically, </w:t>
-      </w:r>
-      <w:r>
-        <w:rPr>
-          <w:rFonts w:ascii="Calibri" w:eastAsia="Calibri" w:hAnsi="Calibri" w:cs="Calibri"/>
-          <w:sz w:val="22"/>
-          <w:szCs w:val="22"/>
-        </w:rPr>
-        <w:t xml:space="preserve">they disagree on the sign of </w:t>
-      </w:r>
-      <w:r>
-        <w:rPr>
-          <w:rFonts w:ascii="Calibri" w:eastAsia="Calibri" w:hAnsi="Calibri" w:cs="Calibri"/>
-          <w:sz w:val="22"/>
-          <w:szCs w:val="22"/>
-        </w:rPr>
-        <w:t xml:space="preserve">terrain </w:t>
-      </w:r>
-      <w:r>
-        <w:rPr>
-          <w:rFonts w:ascii="Calibri" w:eastAsia="Calibri" w:hAnsi="Calibri" w:cs="Calibri"/>
-          <w:sz w:val="22"/>
-          <w:szCs w:val="22"/>
-        </w:rPr>
-        <w:t>ruggedness in a way nothing else would reveal.</w:t>
-      </w:r>
-    </w:p>
-    <w:p>
-      <w:pPr>
-        <w:spacing w:after="200" w:line="276" w:lineRule="auto"/>
-      </w:pPr>
-      <w:r>
-        <w:rPr>
-          <w:rFonts w:ascii="Calibri" w:eastAsia="Calibri" w:hAnsi="Calibri" w:cs="Calibri"/>
-          <w:sz w:val="22"/>
-          <w:szCs w:val="22"/>
-        </w:rPr>
-        <w:t>The work is original, is not published or under consideration elsewhere, and received no external funding. I am the sole author and declare no conflict of interest.</w:t>
       </w:r>
     </w:p>
     <w:p>
       <w:pPr>
         <w:spacing w:after="200" w:line="276" w:lineRule="auto"/>
         <w:ind w:firstLine="720"/>
+        <w:rPr>
+          <w:rFonts w:ascii="Calibri" w:eastAsia="Calibri" w:hAnsi="Calibri" w:cs="Calibri"/>
+          <w:sz w:val="22"/>
+          <w:szCs w:val="22"/>
+        </w:rPr>
+      </w:pPr>
+      <w:r>
+        <w:rPr>
+          <w:rFonts w:ascii="Calibri" w:eastAsia="Calibri" w:hAnsi="Calibri" w:cs="Calibri"/>
+          <w:sz w:val="22"/>
+          <w:szCs w:val="22"/>
+        </w:rPr>
+        <w:t>I wish to submit the attached manuscript, "Testing the wind disruption and disturbance refugia hypothesis for mountain pine beetle outbreaks (Dendroctonus ponderosae); Terrain, stand density and flight-period wind as controls on attack in the Selkirk Mountains of British Columbia", to Journal of Pest Science as an Original Research Paper.</w:t>
+      </w:r>
+    </w:p>
+    <w:p>
+      <w:pPr>
+        <w:spacing w:after="200" w:line="276" w:lineRule="auto"/>
+        <w:ind w:firstLine="720"/>
+        <w:rPr>
+          <w:rFonts w:ascii="Calibri" w:eastAsia="Calibri" w:hAnsi="Calibri" w:cs="Calibri"/>
+          <w:sz w:val="22"/>
+          <w:szCs w:val="22"/>
+        </w:rPr>
+      </w:pPr>
+      <w:r>
+        <w:rPr>
+          <w:rFonts w:ascii="Calibri" w:eastAsia="Calibri" w:hAnsi="Calibri" w:cs="Calibri"/>
+          <w:sz w:val="22"/>
+          <w:szCs w:val="22"/>
+        </w:rPr>
+        <w:t xml:space="preserve">The study takes up a question left open by Krawchuk et al. (2020), who proposed that some stands escape mountain pine beetle outbreaks because shade, low host density and a shortage of large hosts make them refugia, and who named wind as the agent that breaks up the aggregation pheromone in thin stands. The proposal is widely cited but has not been tested on a landscape, largely because wind has been treated as a fixed property of terrain rather than as something that varies through the weeks the beetle flies. This paper tests all three mechanisms </w:t>
+      </w:r>
+      <w:proofErr w:type="gramStart"/>
+      <w:r>
+        <w:rPr>
+          <w:rFonts w:ascii="Calibri" w:eastAsia="Calibri" w:hAnsi="Calibri" w:cs="Calibri"/>
+          <w:sz w:val="22"/>
+          <w:szCs w:val="22"/>
+        </w:rPr>
+        <w:t>together, and</w:t>
+      </w:r>
+      <w:proofErr w:type="gramEnd"/>
+      <w:r>
+        <w:rPr>
+          <w:rFonts w:ascii="Calibri" w:eastAsia="Calibri" w:hAnsi="Calibri" w:cs="Calibri"/>
+          <w:sz w:val="22"/>
+          <w:szCs w:val="22"/>
+        </w:rPr>
+        <w:t xml:space="preserve"> treats wind as a measurement made at the timescale of flight.</w:t>
+      </w:r>
+    </w:p>
+    <w:p>
+      <w:pPr>
+        <w:spacing w:after="200" w:line="276" w:lineRule="auto"/>
+        <w:ind w:firstLine="720"/>
+        <w:rPr>
+          <w:rFonts w:ascii="Calibri" w:eastAsia="Calibri" w:hAnsi="Calibri" w:cs="Calibri"/>
+          <w:sz w:val="22"/>
+          <w:szCs w:val="22"/>
+        </w:rPr>
+      </w:pPr>
+      <w:r>
+        <w:rPr>
+          <w:rFonts w:ascii="Calibri" w:eastAsia="Calibri" w:hAnsi="Calibri" w:cs="Calibri"/>
+          <w:sz w:val="22"/>
+          <w:szCs w:val="22"/>
+        </w:rPr>
+        <w:t xml:space="preserve">Its origin is my companion study of forest recovery on the same ground, Murphy, Leslie, Wilson and Banks (2026), Forest Ecology and Management 618, 123985, which found that terrain ruggedness shaped where the forest returned but could not say why. The present paper reuses that study's ground plots of beetle-killed pine as the ground truth for mapping attack over eight outbreak </w:t>
+      </w:r>
+      <w:proofErr w:type="gramStart"/>
+      <w:r>
+        <w:rPr>
+          <w:rFonts w:ascii="Calibri" w:eastAsia="Calibri" w:hAnsi="Calibri" w:cs="Calibri"/>
+          <w:sz w:val="22"/>
+          <w:szCs w:val="22"/>
+        </w:rPr>
+        <w:t>years, and</w:t>
+      </w:r>
+      <w:proofErr w:type="gramEnd"/>
+      <w:r>
+        <w:rPr>
+          <w:rFonts w:ascii="Calibri" w:eastAsia="Calibri" w:hAnsi="Calibri" w:cs="Calibri"/>
+          <w:sz w:val="22"/>
+          <w:szCs w:val="22"/>
+        </w:rPr>
+        <w:t xml:space="preserve"> separates ruggedness into the components that the beetle's biology points to. The companion paper is uploaded as a related file.</w:t>
+      </w:r>
+    </w:p>
+    <w:p>
+      <w:pPr>
+        <w:spacing w:after="200" w:line="276" w:lineRule="auto"/>
+        <w:ind w:firstLine="720"/>
+        <w:rPr>
+          <w:rFonts w:ascii="Calibri" w:eastAsia="Calibri" w:hAnsi="Calibri" w:cs="Calibri"/>
+          <w:sz w:val="22"/>
+          <w:szCs w:val="22"/>
+        </w:rPr>
+      </w:pPr>
+      <w:r>
+        <w:rPr>
+          <w:rFonts w:ascii="Calibri" w:eastAsia="Calibri" w:hAnsi="Calibri" w:cs="Calibri"/>
+          <w:sz w:val="22"/>
+          <w:szCs w:val="22"/>
+        </w:rPr>
+        <w:t xml:space="preserve">The contribution is a distinction between two ways terrain and wind act on an outbreak. One works through the stand, where wind during the flight period weakens the </w:t>
+      </w:r>
+      <w:proofErr w:type="gramStart"/>
+      <w:r>
+        <w:rPr>
+          <w:rFonts w:ascii="Calibri" w:eastAsia="Calibri" w:hAnsi="Calibri" w:cs="Calibri"/>
+          <w:sz w:val="22"/>
+          <w:szCs w:val="22"/>
+        </w:rPr>
+        <w:t>advantage</w:t>
+      </w:r>
+      <w:proofErr w:type="gramEnd"/>
+      <w:r>
+        <w:rPr>
+          <w:rFonts w:ascii="Calibri" w:eastAsia="Calibri" w:hAnsi="Calibri" w:cs="Calibri"/>
+          <w:sz w:val="22"/>
+          <w:szCs w:val="22"/>
+        </w:rPr>
+        <w:t xml:space="preserve"> a dense canopy gives the beetle. The other works through the landscape, where sheltered and open ground receives more of the beetles the wind carries, whatever the stand. The refugia hypothesis anticipated the first and not the second, and the paper argues that both are needed to map where an outbreak will and will not reach.</w:t>
+      </w:r>
+    </w:p>
+    <w:p>
+      <w:pPr>
+        <w:spacing w:after="200" w:line="276" w:lineRule="auto"/>
+        <w:ind w:firstLine="720"/>
+        <w:rPr>
+          <w:rFonts w:ascii="Calibri" w:eastAsia="Calibri" w:hAnsi="Calibri" w:cs="Calibri"/>
+          <w:sz w:val="22"/>
+          <w:szCs w:val="22"/>
+        </w:rPr>
+      </w:pPr>
+      <w:r>
+        <w:rPr>
+          <w:rFonts w:ascii="Calibri" w:eastAsia="Calibri" w:hAnsi="Calibri" w:cs="Calibri"/>
+          <w:sz w:val="22"/>
+          <w:szCs w:val="22"/>
+        </w:rPr>
+        <w:t>The work is original, is not published or under consideration elsewhere, and received no external funding. I am the sole author and declare no competing interests.</w:t>
+      </w:r>
+    </w:p>
+    <w:p>
+      <w:pPr>
+        <w:spacing w:line="360" w:lineRule="auto"/>
+        <w:ind w:firstLine="720"/>
+        <w:rPr>
+          <w:rFonts w:ascii="Calibri" w:eastAsia="Calibri" w:hAnsi="Calibri" w:cs="Calibri"/>
+          <w:sz w:val="22"/>
+          <w:szCs w:val="22"/>
+        </w:rPr>
       </w:pPr>
       <w:r>
         <w:rPr>
@@ -253,7 +361,7 @@
     </w:p>
     <w:p>
       <w:pPr>
-        <w:spacing w:after="200" w:line="276" w:lineRule="auto"/>
+        <w:spacing w:line="360" w:lineRule="auto"/>
         <w:ind w:left="720" w:firstLine="720"/>
       </w:pPr>
       <w:r>
@@ -262,15 +370,7 @@
           <w:sz w:val="22"/>
           <w:szCs w:val="22"/>
         </w:rPr>
-        <w:t xml:space="preserve">Dr </w:t>
-      </w:r>
-      <w:r>
-        <w:rPr>
-          <w:rFonts w:ascii="Calibri" w:eastAsia="Calibri" w:hAnsi="Calibri" w:cs="Calibri"/>
-          <w:sz w:val="22"/>
-          <w:szCs w:val="22"/>
-        </w:rPr>
-        <w:t>Seamus Murphy</w:t>
+        <w:t>Dr Seamus Murphy</w:t>
       </w:r>
     </w:p>
     <w:sectPr>
@@ -968,6 +1068,18 @@
       <w:szCs w:val="20"/>
     </w:rPr>
   </w:style>
+  <w:style w:type="character" w:styleId="UnresolvedMention">
+    <w:name w:val="Unresolved Mention"/>
+    <w:basedOn w:val="DefaultParagraphFont"/>
+    <w:uiPriority w:val="99"/>
+    <w:semiHidden/>
+    <w:unhideWhenUsed/>
+    <w:rsid w:val="00AD49DE"/>
+    <w:rPr>
+      <w:color w:val="605E5C"/>
+      <w:shd w:val="clear" w:color="auto" w:fill="E1DFDD"/>
+    </w:rPr>
+  </w:style>
 </w:styles>
 </file>
 

</xml_diff>